<commit_message>
Add individual reflection reports and generator
Add generated individual .docx reflection reports for team members and the Python generator used to produce them. New files include individual_report_generator.py plus individual report documents for Batool, Nabeel, Omar, Ragd, and Suhib; DentyHub_Individual_Omar_Al_Shamali_v2.docx was also updated. These artifacts automate and standardise the formal academic reflection reports for the project team.
</commit_message>
<xml_diff>
--- a/DentyHub_Individual_Omar_Al_Shamali_v2.docx
+++ b/DentyHub_Individual_Omar_Al_Shamali_v2.docx
@@ -377,6 +377,14 @@
     </w:p>
     <w:sdt>
       <w:sdtPr>
+        <w:rPr>
+          <w:rFonts w:ascii="Cambria" w:eastAsiaTheme="minorEastAsia" w:hAnsi="Cambria" w:cstheme="minorBidi"/>
+          <w:b w:val="0"/>
+          <w:bCs w:val="0"/>
+          <w:color w:val="auto"/>
+          <w:sz w:val="22"/>
+          <w:szCs w:val="22"/>
+        </w:rPr>
         <w:id w:val="-2140097356"/>
         <w:docPartObj>
           <w:docPartGallery w:val="Table of Contents"/>
@@ -385,11 +393,7 @@
       </w:sdtPr>
       <w:sdtEndPr>
         <w:rPr>
-          <w:rFonts w:ascii="Cambria" w:eastAsiaTheme="minorEastAsia" w:hAnsi="Cambria" w:cstheme="minorBidi"/>
           <w:noProof/>
-          <w:color w:val="auto"/>
-          <w:sz w:val="22"/>
-          <w:szCs w:val="22"/>
         </w:rPr>
       </w:sdtEndPr>
       <w:sdtContent>
@@ -1311,13 +1315,16 @@
       </w:r>
     </w:p>
     <w:p>
+      <w:proofErr w:type="gramStart"/>
       <w:r>
-        <w:t>Third is sharper estimation. I consistently underestimated tasks I had never done before - shader-aware React for Tooth Defender 3D, the i18n RTL pass, the Prisma JSON containment query for additional supervisors. Each of those was 2x to 3x the time I had budgeted. The fix is mechanical: any time I am estimating a task involving a library or pattern I have not shipped before, multiply my gut estimate by three. It feels absurd until I do it twice and it is accurate twice.</w:t>
+        <w:t xml:space="preserve">Finally </w:t>
       </w:r>
-    </w:p>
-    <w:p>
       <w:r>
-        <w:t>Finally, I would document internal vocabulary on day one. We re-explained "redo means a different patient, not the same one" enough times across this project that the sentence now lives in the README and in Appendix E of the group report. That kind of phrase belongs in writing the first time someone says it, not after the third confused conversation.</w:t>
+        <w:t xml:space="preserve"> is</w:t>
+      </w:r>
+      <w:proofErr w:type="gramEnd"/>
+      <w:r>
+        <w:t xml:space="preserve"> sharper estimation. I consistently underestimated tasks I had never done before - shader-aware React for Tooth Defender 3D, the i18n RTL pass, the Prisma JSON containment query for additional supervisors. Each of those was 2x to 3x the time I had budgeted. The fix is mechanical: any time I am estimating a task involving a library or pattern I have not shipped before, multiply my gut estimate by three. It feels absurd until I do it twice and it is accurate twice.</w:t>
       </w:r>
     </w:p>
     <w:p>
@@ -1385,7 +1392,6 @@
       </w:tblPr>
       <w:tblGrid>
         <w:gridCol w:w="3175"/>
-        <w:gridCol w:w="2608"/>
         <w:gridCol w:w="3175"/>
       </w:tblGrid>
       <w:tr>
@@ -1405,22 +1411,6 @@
                 <w:sz w:val="21"/>
               </w:rPr>
               <w:t>Surface</w:t>
-            </w:r>
-          </w:p>
-        </w:tc>
-        <w:tc>
-          <w:tcPr>
-            <w:tcW w:w="2608" w:type="dxa"/>
-            <w:shd w:val="clear" w:color="auto" w:fill="E7EEF2"/>
-            <w:vAlign w:val="center"/>
-          </w:tcPr>
-          <w:p>
-            <w:r>
-              <w:rPr>
-                <w:b/>
-                <w:sz w:val="21"/>
-              </w:rPr>
-              <w:t>Approximate LOC authored</w:t>
             </w:r>
           </w:p>
         </w:tc>
@@ -1461,20 +1451,6 @@
         </w:tc>
         <w:tc>
           <w:tcPr>
-            <w:tcW w:w="2608" w:type="dxa"/>
-            <w:vAlign w:val="center"/>
-          </w:tcPr>
-          <w:p>
-            <w:r>
-              <w:rPr>
-                <w:sz w:val="21"/>
-              </w:rPr>
-              <w:t>—</w:t>
-            </w:r>
-          </w:p>
-        </w:tc>
-        <w:tc>
-          <w:tcPr>
             <w:tcW w:w="3175" w:type="dxa"/>
             <w:vAlign w:val="center"/>
           </w:tcPr>
@@ -1508,29 +1484,25 @@
         </w:tc>
         <w:tc>
           <w:tcPr>
-            <w:tcW w:w="2608" w:type="dxa"/>
+            <w:tcW w:w="3175" w:type="dxa"/>
             <w:vAlign w:val="center"/>
           </w:tcPr>
           <w:p>
+            <w:proofErr w:type="spellStart"/>
+            <w:proofErr w:type="gramStart"/>
             <w:r>
               <w:rPr>
                 <w:sz w:val="21"/>
               </w:rPr>
-              <w:t>~1,400</w:t>
+              <w:t>schema.prisma</w:t>
             </w:r>
-          </w:p>
-        </w:tc>
-        <w:tc>
-          <w:tcPr>
-            <w:tcW w:w="3175" w:type="dxa"/>
-            <w:vAlign w:val="center"/>
-          </w:tcPr>
-          <w:p>
+            <w:proofErr w:type="spellEnd"/>
+            <w:proofErr w:type="gramEnd"/>
             <w:r>
               <w:rPr>
                 <w:sz w:val="21"/>
               </w:rPr>
-              <w:t>schema.prisma (41 models, 18 enums) + migration discipline</w:t>
+              <w:t xml:space="preserve"> (41 models, 18 enums) + migration discipline</w:t>
             </w:r>
           </w:p>
         </w:tc>
@@ -1555,20 +1527,6 @@
         </w:tc>
         <w:tc>
           <w:tcPr>
-            <w:tcW w:w="2608" w:type="dxa"/>
-            <w:vAlign w:val="center"/>
-          </w:tcPr>
-          <w:p>
-            <w:r>
-              <w:rPr>
-                <w:sz w:val="21"/>
-              </w:rPr>
-              <w:t>~5,200</w:t>
-            </w:r>
-          </w:p>
-        </w:tc>
-        <w:tc>
-          <w:tcPr>
             <w:tcW w:w="3175" w:type="dxa"/>
             <w:vAlign w:val="center"/>
           </w:tcPr>
@@ -1577,7 +1535,7 @@
               <w:rPr>
                 <w:sz w:val="21"/>
               </w:rPr>
-              <w:t>~50 controllers, services, DTOs, guards</w:t>
+              <w:t>controllers, services, DTOs, guards</w:t>
             </w:r>
           </w:p>
         </w:tc>
@@ -1597,20 +1555,6 @@
                 <w:sz w:val="21"/>
               </w:rPr>
               <w:t>Arcade engine + 6 game components</w:t>
-            </w:r>
-          </w:p>
-        </w:tc>
-        <w:tc>
-          <w:tcPr>
-            <w:tcW w:w="2608" w:type="dxa"/>
-            <w:vAlign w:val="center"/>
-          </w:tcPr>
-          <w:p>
-            <w:r>
-              <w:rPr>
-                <w:sz w:val="21"/>
-              </w:rPr>
-              <w:t>~3,400</w:t>
             </w:r>
           </w:p>
         </w:tc>
@@ -1649,29 +1593,23 @@
         </w:tc>
         <w:tc>
           <w:tcPr>
-            <w:tcW w:w="2608" w:type="dxa"/>
+            <w:tcW w:w="3175" w:type="dxa"/>
             <w:vAlign w:val="center"/>
           </w:tcPr>
           <w:p>
+            <w:proofErr w:type="gramStart"/>
             <w:r>
               <w:rPr>
                 <w:sz w:val="21"/>
               </w:rPr>
-              <w:t>~1,400</w:t>
+              <w:t>smile</w:t>
             </w:r>
-          </w:p>
-        </w:tc>
-        <w:tc>
-          <w:tcPr>
-            <w:tcW w:w="3175" w:type="dxa"/>
-            <w:vAlign w:val="center"/>
-          </w:tcPr>
-          <w:p>
+            <w:proofErr w:type="gramEnd"/>
             <w:r>
               <w:rPr>
                 <w:sz w:val="21"/>
               </w:rPr>
-              <w:t>smile-streak module + surface + badges + widget + streak leaderboard tab</w:t>
+              <w:t>-streak module + surface + badges + widget + streak leaderboard tab</w:t>
             </w:r>
           </w:p>
         </w:tc>
@@ -1696,29 +1634,23 @@
         </w:tc>
         <w:tc>
           <w:tcPr>
-            <w:tcW w:w="2608" w:type="dxa"/>
+            <w:tcW w:w="3175" w:type="dxa"/>
             <w:vAlign w:val="center"/>
           </w:tcPr>
           <w:p>
+            <w:proofErr w:type="spellStart"/>
             <w:r>
               <w:rPr>
                 <w:sz w:val="21"/>
               </w:rPr>
-              <w:t>~3,000 keys</w:t>
+              <w:t>dictionary.ts</w:t>
             </w:r>
-          </w:p>
-        </w:tc>
-        <w:tc>
-          <w:tcPr>
-            <w:tcW w:w="3175" w:type="dxa"/>
-            <w:vAlign w:val="center"/>
-          </w:tcPr>
-          <w:p>
+            <w:proofErr w:type="spellEnd"/>
             <w:r>
               <w:rPr>
                 <w:sz w:val="21"/>
               </w:rPr>
-              <w:t>dictionary.ts + language-provider + RTL sweep on every patient-facing screen</w:t>
+              <w:t xml:space="preserve"> + language-provider + RTL sweep on every patient-facing screen</w:t>
             </w:r>
           </w:p>
         </w:tc>
@@ -1738,20 +1670,6 @@
                 <w:sz w:val="21"/>
               </w:rPr>
               <w:t>Patient booking flow + appointment lifecycle UI</w:t>
-            </w:r>
-          </w:p>
-        </w:tc>
-        <w:tc>
-          <w:tcPr>
-            <w:tcW w:w="2608" w:type="dxa"/>
-            <w:vAlign w:val="center"/>
-          </w:tcPr>
-          <w:p>
-            <w:r>
-              <w:rPr>
-                <w:sz w:val="21"/>
-              </w:rPr>
-              <w:t>~1,800</w:t>
             </w:r>
           </w:p>
         </w:tc>
@@ -1790,20 +1708,6 @@
         </w:tc>
         <w:tc>
           <w:tcPr>
-            <w:tcW w:w="2608" w:type="dxa"/>
-            <w:vAlign w:val="center"/>
-          </w:tcPr>
-          <w:p>
-            <w:r>
-              <w:rPr>
-                <w:sz w:val="21"/>
-              </w:rPr>
-              <w:t>~2,000</w:t>
-            </w:r>
-          </w:p>
-        </w:tc>
-        <w:tc>
-          <w:tcPr>
             <w:tcW w:w="3175" w:type="dxa"/>
             <w:vAlign w:val="center"/>
           </w:tcPr>
@@ -1837,20 +1741,6 @@
         </w:tc>
         <w:tc>
           <w:tcPr>
-            <w:tcW w:w="2608" w:type="dxa"/>
-            <w:vAlign w:val="center"/>
-          </w:tcPr>
-          <w:p>
-            <w:r>
-              <w:rPr>
-                <w:sz w:val="21"/>
-              </w:rPr>
-              <w:t>~2,400</w:t>
-            </w:r>
-          </w:p>
-        </w:tc>
-        <w:tc>
-          <w:tcPr>
             <w:tcW w:w="3175" w:type="dxa"/>
             <w:vAlign w:val="center"/>
           </w:tcPr>
@@ -1879,20 +1769,6 @@
                 <w:sz w:val="21"/>
               </w:rPr>
               <w:t>Group + individual reports + UML / architecture diagrams</w:t>
-            </w:r>
-          </w:p>
-        </w:tc>
-        <w:tc>
-          <w:tcPr>
-            <w:tcW w:w="2608" w:type="dxa"/>
-            <w:vAlign w:val="center"/>
-          </w:tcPr>
-          <w:p>
-            <w:r>
-              <w:rPr>
-                <w:sz w:val="21"/>
-              </w:rPr>
-              <w:t>~8 .docx + 7 figures</w:t>
             </w:r>
           </w:p>
         </w:tc>
@@ -3094,7 +2970,6 @@
   <w:style w:type="character" w:default="1" w:styleId="DefaultParagraphFont">
     <w:name w:val="Default Paragraph Font"/>
     <w:uiPriority w:val="1"/>
-    <w:semiHidden/>
     <w:unhideWhenUsed/>
   </w:style>
   <w:style w:type="table" w:default="1" w:styleId="TableNormal">

</xml_diff>